<commit_message>
Uncheck Note book assessment tool for all CSE 2232 COs
</commit_message>
<xml_diff>
--- a/36-CSE 2232_U.docx
+++ b/36-CSE 2232_U.docx
@@ -1404,7 +1404,7 @@
                         <w:sz w:val="18"/>
                         <w:szCs w:val="18"/>
                       </w:rPr>
-                      <w:t>☒</w:t>
+                      <w:t>☐</w:t>
                     </w:r>
                   </w:sdtContent>
                 </w:sdt>
@@ -2087,7 +2087,7 @@
                     <w:sz w:val="18"/>
                     <w:szCs w:val="18"/>
                   </w:rPr>
-                  <w:t>☒</w:t>
+                  <w:t>☐</w:t>
                 </w:r>
               </w:sdtContent>
             </w:sdt>
@@ -2760,7 +2760,7 @@
                     <w:sz w:val="18"/>
                     <w:szCs w:val="18"/>
                   </w:rPr>
-                  <w:t>☒</w:t>
+                  <w:t>☐</w:t>
                 </w:r>
               </w:sdtContent>
             </w:sdt>

</xml_diff>

<commit_message>
Use cognitive-pyramid verbs and levels for lab course COs
Lab COs were mislabelled Psychomotor; 'construct' is Cognitive L6 and 'use'/'implement' L3 per the BAETE cognitive pyramid.
- CSE 2232: CO1 implement (L3), CO2 construct (L6)
- CSE 3172: CO1 use (L3), CO2 construct (L6)
- CSE 3252: CO1 construct (L6), CO2 develop (L6, reworded), CO3 use (L3)
Drafts, Syllabus, and Handout copies updated together.
</commit_message>
<xml_diff>
--- a/36-CSE 2232_U.docx
+++ b/36-CSE 2232_U.docx
@@ -833,7 +833,7 @@
                 <w:sz w:val="18"/>
                 <w:szCs w:val="18"/>
               </w:rPr>
-              <w:t>reproduce</w:t>
+              <w:t>implement</w:t>
             </w:r>
             <w:r>
               <w:rPr>
@@ -939,7 +939,7 @@
                 <w:sz w:val="18"/>
                 <w:szCs w:val="18"/>
               </w:rPr>
-              <w:t>Psychomotor domain – level 3</w:t>
+              <w:t>Cognitive domain – level 3</w:t>
             </w:r>
           </w:p>
         </w:tc>
@@ -1640,7 +1640,7 @@
                 <w:sz w:val="18"/>
                 <w:szCs w:val="18"/>
               </w:rPr>
-              <w:t>Psychomotor domain – level 4</w:t>
+              <w:t>Cognitive domain – level 6</w:t>
             </w:r>
           </w:p>
         </w:tc>

</xml_diff>